<commit_message>
Klausul potong bonus di S&K v1.4 dan butirnya di Catatan Hukum v1.3
- S&K Pasal 21 angka 7 (baru): pembayaran Langganan dari bonus hanya atas persetujuan
  tegas per pembayaran, tidak otomatis, bukan syarat bonus/peringkat, dipotong dari
  transfer setelah PPh, hanya Langganan milik sendiri, paling banyak 1 periode di muka,
  aturan pembatalan, dan Plan B tetap dihitung. Pasal 5 merujuk klausul ini; Pasal 6
  memuat jadwal pengingat (H-7, H-3, H-1, H, sehari sesudah berakhir) dan persetujuan
  saluran surel/WhatsApp.
- Catatan Hukum v1.3: butir 19 Bagian 1 (wajib beli, perjumpaan utang, PPN/PPh) dan
  keputusan A17 Bagian 2B.
- Halaman depan dan Kantor Maya diselaraskan.

Co-Authored-By: Claude Opus 5.5 <noreply@anthropic.com>
Claude-Session: https://claude.ai/code/session_01C9951NUBJe5HCAhFhZ3PsQ
</commit_message>
<xml_diff>
--- a/docs/dokumen/Catatan_untuk_Konsultan_Hukum_Mitrans-Astra_v1.3.docx
+++ b/docs/dokumen/Catatan_untuk_Konsultan_Hukum_Mitrans-Astra_v1.3.docx
@@ -274,7 +274,7 @@
       </w:pPr>
       <w:r>
         <w:rPr/>
-        <w:t>Bagian 2B: keputusan aturan sistem v1.3–v1.4 (A1–A16) yang sudah diputuskan Coach pada 27 Oktober 2026, beserta butir yang perlu dinilai konsultan hukum;</w:t>
+        <w:t>Bagian 2B: keputusan aturan sistem v1.3–v1.4 (A1–A17) yang sudah diputuskan Coach pada 27 Oktober 2026, beserta butir yang perlu dinilai konsultan hukum;</w:t>
       </w:r>
     </w:p>
     <w:p>
@@ -318,7 +318,7 @@
       </w:r>
       <w:r>
         <w:rPr/>
-        <w:t xml:space="preserve"> (27 Oktober 2026): menyertai dokumen v1.4 (Lisensi tanpa batas waktu, Langganan setiap 30 hari sejak aktivasi, rekening dana layanan dihapus). Butir 17–18 Bagian 1 dan A14–A16 Bagian 2B baru; butir 4 dan 15 Bagian 1 diperbarui.</w:t>
+        <w:t xml:space="preserve"> (27 Oktober 2026): menyertai dokumen v1.4 (Lisensi tanpa batas waktu, Langganan setiap 30 hari sejak aktivasi, rekening dana layanan dihapus, pembayaran Langganan dari bonus). Butir 17–19 Bagian 1 dan A14–A17 Bagian 2B baru; butir 4 dan 15 Bagian 1 diperbarui.</w:t>
       </w:r>
     </w:p>
     <w:p>
@@ -2973,6 +2973,143 @@
           </w:p>
         </w:tc>
       </w:tr>
+      <w:tr>
+        <w:trPr>
+          <w:cantSplit w:val="true"/>
+        </w:trPr>
+        <w:tc>
+          <w:tcPr>
+            <w:tcW w:w="558" w:type="dxa"/>
+            <w:tcBorders>
+              <w:top w:val="single" w:sz="4" w:space="0" w:color="B7C4C9"/>
+              <w:left w:val="single" w:sz="4" w:space="0" w:color="B7C4C9"/>
+              <w:bottom w:val="single" w:sz="4" w:space="0" w:color="B7C4C9"/>
+              <w:right w:val="single" w:sz="4" w:space="0" w:color="B7C4C9"/>
+            </w:tcBorders>
+          </w:tcPr>
+          <w:p>
+            <w:pPr>
+              <w:pStyle w:val="Normal"/>
+              <w:spacing w:before="0" w:after="0"/>
+              <w:jc w:val="left"/>
+              <w:rPr/>
+            </w:pPr>
+            <w:r>
+              <w:rPr>
+                <w:sz w:val="19"/>
+                <w:szCs w:val="19"/>
+              </w:rPr>
+              <w:t>19</w:t>
+            </w:r>
+          </w:p>
+        </w:tc>
+        <w:tc>
+          <w:tcPr>
+            <w:tcW w:w="1395" w:type="dxa"/>
+            <w:tcBorders>
+              <w:top w:val="single" w:sz="4" w:space="0" w:color="B7C4C9"/>
+              <w:left w:val="single" w:sz="4" w:space="0" w:color="B7C4C9"/>
+              <w:bottom w:val="single" w:sz="4" w:space="0" w:color="B7C4C9"/>
+              <w:right w:val="single" w:sz="4" w:space="0" w:color="B7C4C9"/>
+            </w:tcBorders>
+          </w:tcPr>
+          <w:p>
+            <w:pPr>
+              <w:pStyle w:val="Normal"/>
+              <w:spacing w:before="0" w:after="0"/>
+              <w:jc w:val="left"/>
+              <w:rPr/>
+            </w:pPr>
+            <w:r>
+              <w:rPr>
+                <w:b/>
+                <w:bCs/>
+                <w:sz w:val="19"/>
+                <w:szCs w:val="19"/>
+              </w:rPr>
+              <w:t>Pembayaran Langganan dari bonus (potong bonus)</w:t>
+            </w:r>
+          </w:p>
+        </w:tc>
+        <w:tc>
+          <w:tcPr>
+            <w:tcW w:w="2045" w:type="dxa"/>
+            <w:tcBorders>
+              <w:top w:val="single" w:sz="4" w:space="0" w:color="B7C4C9"/>
+              <w:left w:val="single" w:sz="4" w:space="0" w:color="B7C4C9"/>
+              <w:bottom w:val="single" w:sz="4" w:space="0" w:color="B7C4C9"/>
+              <w:right w:val="single" w:sz="4" w:space="0" w:color="B7C4C9"/>
+            </w:tcBorders>
+          </w:tcPr>
+          <w:p>
+            <w:pPr>
+              <w:pStyle w:val="Normal"/>
+              <w:spacing w:before="0" w:after="0"/>
+              <w:jc w:val="left"/>
+              <w:rPr/>
+            </w:pPr>
+            <w:r>
+              <w:rPr>
+                <w:sz w:val="19"/>
+                <w:szCs w:val="19"/>
+              </w:rPr>
+              <w:t>Permendag 70/2019 Pasal 21 huruf f dan g; KUHPerdata Pasal 1425 dan seterusnya (perjumpaan utang); ketentuan PPh atas komisi</w:t>
+            </w:r>
+          </w:p>
+        </w:tc>
+        <w:tc>
+          <w:tcPr>
+            <w:tcW w:w="2421" w:type="dxa"/>
+            <w:tcBorders>
+              <w:top w:val="single" w:sz="4" w:space="0" w:color="B7C4C9"/>
+              <w:left w:val="single" w:sz="4" w:space="0" w:color="B7C4C9"/>
+              <w:bottom w:val="single" w:sz="4" w:space="0" w:color="B7C4C9"/>
+              <w:right w:val="single" w:sz="4" w:space="0" w:color="B7C4C9"/>
+            </w:tcBorders>
+          </w:tcPr>
+          <w:p>
+            <w:pPr>
+              <w:pStyle w:val="Normal"/>
+              <w:spacing w:before="0" w:after="0"/>
+              <w:jc w:val="left"/>
+              <w:rPr/>
+            </w:pPr>
+            <w:r>
+              <w:rPr>
+                <w:sz w:val="19"/>
+                <w:szCs w:val="19"/>
+              </w:rPr>
+              <w:t>S&amp;K Pasal 21 angka 7: pilihan, persetujuan tegas pada setiap pembayaran, tidak otomatis, bukan syarat bonus atau peringkat; dipotong dari transfer setelah PPh; hanya untuk Langganan milik sendiri; paling banyak satu periode di muka. Sistem prototipe belum menghitung PPh, sehingga saldo yang tampil masih bruto</w:t>
+            </w:r>
+          </w:p>
+        </w:tc>
+        <w:tc>
+          <w:tcPr>
+            <w:tcW w:w="2887" w:type="dxa"/>
+            <w:tcBorders>
+              <w:top w:val="single" w:sz="4" w:space="0" w:color="B7C4C9"/>
+              <w:left w:val="single" w:sz="4" w:space="0" w:color="B7C4C9"/>
+              <w:bottom w:val="single" w:sz="4" w:space="0" w:color="B7C4C9"/>
+              <w:right w:val="single" w:sz="4" w:space="0" w:color="B7C4C9"/>
+            </w:tcBorders>
+          </w:tcPr>
+          <w:p>
+            <w:pPr>
+              <w:pStyle w:val="Normal"/>
+              <w:spacing w:before="0" w:after="0"/>
+              <w:jc w:val="left"/>
+              <w:rPr/>
+            </w:pPr>
+            <w:r>
+              <w:rPr>
+                <w:sz w:val="19"/>
+                <w:szCs w:val="19"/>
+              </w:rPr>
+              <w:t>Konfirmasi bahwa fitur ini tidak dinilai sebagai kewajiban atau dorongan membeli, bahwa persetujuan per pembayaran cukup sebagai dasar memperhitungkan tagihan dengan bonus, dan perlakuan PPN atas Langganan serta PPh atas bonus yang dipotong</w:t>
+            </w:r>
+          </w:p>
+        </w:tc>
+      </w:tr>
     </w:tbl>
     <w:p>
       <w:pPr>
@@ -5011,7 +5148,7 @@
       </w:pPr>
       <w:r>
         <w:rPr/>
-        <w:t>Butir A1–A12 tidak diatur Rencana Pemasaran v1.0–v1.2; butir A13 mengubah syarat aktif. Coach memutuskannya saat sistem perhitungan dirancang dan diuji, dan semuanya sudah dicantumkan di dokumen v1.3. Butir bertanda "Perlu dinilai" mohon diberi pendapat konsultan hukum. Butir A14–A16 (Lisensi tanpa batas waktu, Langganan 30 hari, penghapusan rekening dana layanan) diputuskan Coach kemudian pada hari yang sama dan dicantumkan di dokumen v1.4.</w:t>
+        <w:t>Butir A1–A12 tidak diatur Rencana Pemasaran v1.0–v1.2; butir A13 mengubah syarat aktif. Coach memutuskannya saat sistem perhitungan dirancang dan diuji, dan semuanya sudah dicantumkan di dokumen v1.3. Butir bertanda "Perlu dinilai" mohon diberi pendapat konsultan hukum. Butir A14–A17 (Lisensi tanpa batas waktu, Langganan 30 hari, penghapusan rekening dana layanan, pembayaran Langganan dari bonus) diputuskan Coach kemudian pada hari yang sama dan dicantumkan di dokumen v1.4.</w:t>
       </w:r>
     </w:p>
     <w:tbl>
@@ -6546,6 +6683,104 @@
           </w:p>
         </w:tc>
       </w:tr>
+      <w:tr>
+        <w:trPr>
+          <w:cantSplit w:val="true"/>
+        </w:trPr>
+        <w:tc>
+          <w:tcPr>
+            <w:tcW w:w="558" w:type="dxa"/>
+            <w:tcBorders>
+              <w:top w:val="single" w:sz="4" w:space="0" w:color="B7C4C9"/>
+              <w:left w:val="single" w:sz="4" w:space="0" w:color="B7C4C9"/>
+              <w:bottom w:val="single" w:sz="4" w:space="0" w:color="B7C4C9"/>
+              <w:right w:val="single" w:sz="4" w:space="0" w:color="B7C4C9"/>
+            </w:tcBorders>
+          </w:tcPr>
+          <w:p>
+            <w:pPr>
+              <w:pStyle w:val="Normal"/>
+              <w:spacing w:before="0" w:after="0"/>
+              <w:jc w:val="left"/>
+              <w:rPr/>
+            </w:pPr>
+            <w:r>
+              <w:rPr>
+                <w:sz w:val="19"/>
+                <w:szCs w:val="19"/>
+              </w:rPr>
+              <w:t>A17</w:t>
+            </w:r>
+          </w:p>
+        </w:tc>
+        <w:tc>
+          <w:tcPr>
+            <w:tcW w:w="5583" w:type="dxa"/>
+            <w:tcBorders>
+              <w:top w:val="single" w:sz="4" w:space="0" w:color="B7C4C9"/>
+              <w:left w:val="single" w:sz="4" w:space="0" w:color="B7C4C9"/>
+              <w:bottom w:val="single" w:sz="4" w:space="0" w:color="B7C4C9"/>
+              <w:right w:val="single" w:sz="4" w:space="0" w:color="B7C4C9"/>
+            </w:tcBorders>
+          </w:tcPr>
+          <w:p>
+            <w:pPr>
+              <w:pStyle w:val="Normal"/>
+              <w:spacing w:before="0" w:after="0"/>
+              <w:jc w:val="left"/>
+              <w:rPr/>
+            </w:pPr>
+            <w:r>
+              <w:rPr>
+                <w:sz w:val="19"/>
+                <w:szCs w:val="19"/>
+              </w:rPr>
+              <w:t>Mitra PLS dapat membayar Langganannya sendiri dari bonus yang belum ditransfer, atas persetujuan tegas pada setiap pembayaran; dipotong dari transfer Jumat terdekat setelah PPh; bonus bruto tidak berubah; Plan B atas Langganan itu tetap dihitung.</w:t>
+            </w:r>
+          </w:p>
+          <w:p>
+            <w:pPr>
+              <w:pStyle w:val="Normal"/>
+              <w:spacing w:before="0" w:after="0"/>
+              <w:jc w:val="left"/>
+              <w:rPr/>
+            </w:pPr>
+            <w:r>
+              <w:rPr>
+                <w:sz w:val="19"/>
+                <w:szCs w:val="19"/>
+              </w:rPr>
+              <w:t>Perlu dinilai: butir 19 Bagian 1</w:t>
+            </w:r>
+          </w:p>
+        </w:tc>
+        <w:tc>
+          <w:tcPr>
+            <w:tcW w:w="3165" w:type="dxa"/>
+            <w:tcBorders>
+              <w:top w:val="single" w:sz="4" w:space="0" w:color="B7C4C9"/>
+              <w:left w:val="single" w:sz="4" w:space="0" w:color="B7C4C9"/>
+              <w:bottom w:val="single" w:sz="4" w:space="0" w:color="B7C4C9"/>
+              <w:right w:val="single" w:sz="4" w:space="0" w:color="B7C4C9"/>
+            </w:tcBorders>
+          </w:tcPr>
+          <w:p>
+            <w:pPr>
+              <w:pStyle w:val="Normal"/>
+              <w:spacing w:before="0" w:after="0"/>
+              <w:jc w:val="left"/>
+              <w:rPr/>
+            </w:pPr>
+            <w:r>
+              <w:rPr>
+                <w:sz w:val="19"/>
+                <w:szCs w:val="19"/>
+              </w:rPr>
+              <w:t>S&amp;K Pasal 5 dan Pasal 21 angka 7</w:t>
+            </w:r>
+          </w:p>
+        </w:tc>
+      </w:tr>
     </w:tbl>
     <w:p>
       <w:pPr>
@@ -6774,7 +7009,7 @@
       </w:pPr>
       <w:r>
         <w:rPr/>
-        <w:t>Coach mengonfirmasi Bagian 2. Keputusan A1–A16 sudah diambil dan dicantumkan di dokumen v1.3–v1.4 (Bagian 2B).</w:t>
+        <w:t>Coach mengonfirmasi Bagian 2. Keputusan A1–A17 sudah diambil dan dicantumkan di dokumen v1.3–v1.4 (Bagian 2B).</w:t>
       </w:r>
     </w:p>
     <w:p>
@@ -6819,7 +7054,7 @@
       </w:pPr>
       <w:r>
         <w:rPr/>
-        <w:t>Konsultan hukum menilai hasil uji ulang dan asumsinya di Rencana Pemasaran Bab 12.3, serta rumus batas atas Langganan (butir 15–16 Bagian 1), serta istilah Lisensi tanpa batas waktu dan syarat Langganan (butir 17–18 Bagian 1).</w:t>
+        <w:t>Konsultan hukum menilai hasil uji ulang dan asumsinya di Rencana Pemasaran Bab 12.3, serta rumus batas atas Langganan (butir 15–16 Bagian 1), serta istilah Lisensi tanpa batas waktu, syarat Langganan, dan pembayaran Langganan dari bonus (butir 17–19 Bagian 1).</w:t>
       </w:r>
     </w:p>
     <w:sectPr>
@@ -6899,7 +7134,7 @@
     </w:r>
     <w:r>
       <w:rPr/>
-      <w:t>8</w:t>
+      <w:t>9</w:t>
     </w:r>
     <w:r>
       <w:rPr/>
@@ -6927,7 +7162,7 @@
     </w:r>
     <w:r>
       <w:rPr/>
-      <w:t>8</w:t>
+      <w:t>9</w:t>
     </w:r>
     <w:r>
       <w:rPr/>

</xml_diff>

<commit_message>
PPh 21 bukan pegawai atas bonus; potong bonus dari saldo setelah pajak
- tax.ts: PPh 21 = tarif Pasal 17 ayat (1) huruf a x 50% bruto (PMK 168/2023,
  tanpa kumulatif tahunan); lapisan tarif atas bruto masa pajak berjalan per Jumat;
  tambahan 20% tanpa NPWP opsional per akun (withoutNpwp).
- Engine: payoutSchedule/pendingPayouts memuat bruto, PPh 21, potongan, dan nilai
  transfer; bonusBalance setelah PPh; potongan Langganan tidak mengubah PPh;
  payoutRuns memuat tax dan transfer = bruto - PPh - potongan.
- Kantor Maya dan Admin: kolom PPh 21; pengingat menyebut saldo setelah PPh.
- Catatan Hukum v1.3 butir 19 diperbarui; ARSITEKTUR Bab 13.
- 7 uji baru; 136 uji lulus. Rumus perlu dikonfirmasi konsultan pajak.

Co-Authored-By: Claude Opus 5.5 <noreply@anthropic.com>
Claude-Session: https://claude.ai/code/session_01C9951NUBJe5HCAhFhZ3PsQ
</commit_message>
<xml_diff>
--- a/docs/dokumen/Catatan_untuk_Konsultan_Hukum_Mitrans-Astra_v1.3.docx
+++ b/docs/dokumen/Catatan_untuk_Konsultan_Hukum_Mitrans-Astra_v1.3.docx
@@ -3079,7 +3079,7 @@
                 <w:sz w:val="19"/>
                 <w:szCs w:val="19"/>
               </w:rPr>
-              <w:t>S&amp;K Pasal 21 angka 7: pilihan, persetujuan tegas pada setiap pembayaran, tidak otomatis, bukan syarat bonus atau peringkat; dipotong dari transfer setelah PPh; hanya untuk Langganan milik sendiri; paling banyak satu periode di muka. Sistem prototipe belum menghitung PPh, sehingga saldo yang tampil masih bruto</w:t>
+              <w:t>S&amp;K Pasal 21 angka 7: pilihan, persetujuan tegas pada setiap pembayaran, tidak otomatis, bukan syarat bonus atau peringkat; dipotong dari transfer setelah PPh; hanya untuk Langganan milik sendiri; paling banyak satu periode di muka. Sistem menghitung PPh 21 bukan pegawai (50% bruto × tarif Pasal 17, lapisan tarif atas bruto bulan berjalan) per Jumat, lalu memotong Langganan dari sisanya</w:t>
             </w:r>
           </w:p>
         </w:tc>
@@ -3105,7 +3105,7 @@
                 <w:sz w:val="19"/>
                 <w:szCs w:val="19"/>
               </w:rPr>
-              <w:t>Konfirmasi bahwa fitur ini tidak dinilai sebagai kewajiban atau dorongan membeli, bahwa persetujuan per pembayaran cukup sebagai dasar memperhitungkan tagihan dengan bonus, dan perlakuan PPN atas Langganan serta PPh atas bonus yang dipotong</w:t>
+              <w:t>Konfirmasi bahwa fitur ini tidak dinilai sebagai kewajiban atau dorongan membeli, bahwa persetujuan per pembayaran cukup sebagai dasar memperhitungkan tagihan dengan bonus, dan perlakuan PPN atas Langganan serta PPh atas bonus yang dipotong. Mohon konsultan pajak memastikan rumus PPh 21 terhadap naskah resmi PMK 168/2023, termasuk masa pajak sebagai satuan lapisan tarif dan tarif tanpa NPWP</w:t>
             </w:r>
           </w:p>
         </w:tc>

</xml_diff>

<commit_message>
Piutang penarikan bonus: dipotong dari hak lain, lalu dihapus setelah 12 bulan
- Engine: recordOtherEntitlement (pembelian kembali, pengembalian dana, lainnya)
  menutup piutang penarikan lebih dulu, sisanya dibayarkan; sumber potongan
  diproses menurut urutan waktu (transfer bonus, hak lain); sisa dihapus 12 bulan
  sejak penarikan (PLAN.clawbackWriteOffMonths) dan tidak lagi dipotong.
- Kantor Maya: sumber potongan dan tanggal hapus. Admin: panel Piutang penarikan &
  hak lain dengan formulir pencatatan (izin pembayaran.siapkan, tercatat di audit).
- API: POST /api/admin/hak-lain.
- Dokumen: RP v1.4 Bab 13, Kode Etik v1.4 Pasal 5, S&K v1.4 Pasal 7, Catatan Hukum
  v1.3 A18. ARSITEKTUR A17-A18 dan 13.1.
- 6 uji baru; 149 uji lulus.

Co-Authored-By: Claude Opus 5.5 <noreply@anthropic.com>
Claude-Session: https://claude.ai/code/session_01C9951NUBJe5HCAhFhZ3PsQ
</commit_message>
<xml_diff>
--- a/docs/dokumen/Catatan_untuk_Konsultan_Hukum_Mitrans-Astra_v1.3.docx
+++ b/docs/dokumen/Catatan_untuk_Konsultan_Hukum_Mitrans-Astra_v1.3.docx
@@ -274,7 +274,7 @@
       </w:pPr>
       <w:r>
         <w:rPr/>
-        <w:t>Bagian 2B: keputusan aturan sistem v1.3–v1.4 (A1–A17) yang sudah diputuskan Coach pada 27 Oktober 2026, beserta butir yang perlu dinilai konsultan hukum;</w:t>
+        <w:t>Bagian 2B: keputusan aturan sistem v1.3–v1.4 (A1–A18) yang sudah diputuskan Coach pada 27 Oktober 2026, beserta butir yang perlu dinilai konsultan hukum;</w:t>
       </w:r>
     </w:p>
     <w:p>
@@ -318,7 +318,7 @@
       </w:r>
       <w:r>
         <w:rPr/>
-        <w:t xml:space="preserve"> (27 Oktober 2026): menyertai dokumen v1.4 (Lisensi tanpa batas waktu, Langganan setiap 30 hari sejak aktivasi, rekening dana layanan dihapus, pembayaran Langganan dari bonus). Butir 17–19 Bagian 1 dan A14–A17 Bagian 2B baru; butir 4 dan 15 Bagian 1 diperbarui.</w:t>
+        <w:t xml:space="preserve"> (27 Oktober 2026): menyertai dokumen v1.4 (Lisensi tanpa batas waktu, Langganan setiap 30 hari sejak aktivasi, rekening dana layanan dihapus, pembayaran Langganan dari bonus, penyelesaian piutang penarikan). Butir 17–19 Bagian 1 dan A14–A18 Bagian 2B baru; butir 4 dan 15 Bagian 1 diperbarui.</w:t>
       </w:r>
     </w:p>
     <w:p>
@@ -5148,7 +5148,7 @@
       </w:pPr>
       <w:r>
         <w:rPr/>
-        <w:t>Butir A1–A12 tidak diatur Rencana Pemasaran v1.0–v1.2; butir A13 mengubah syarat aktif. Coach memutuskannya saat sistem perhitungan dirancang dan diuji, dan semuanya sudah dicantumkan di dokumen v1.3. Butir bertanda "Perlu dinilai" mohon diberi pendapat konsultan hukum. Butir A14–A17 (Lisensi tanpa batas waktu, Langganan 30 hari, penghapusan rekening dana layanan, pembayaran Langganan dari bonus) diputuskan Coach kemudian pada hari yang sama dan dicantumkan di dokumen v1.4.</w:t>
+        <w:t>Butir A1–A12 tidak diatur Rencana Pemasaran v1.0–v1.2; butir A13 mengubah syarat aktif. Coach memutuskannya saat sistem perhitungan dirancang dan diuji, dan semuanya sudah dicantumkan di dokumen v1.3. Butir bertanda "Perlu dinilai" mohon diberi pendapat konsultan hukum. Butir A14–A18 (Lisensi tanpa batas waktu, Langganan 30 hari, penghapusan rekening dana layanan, pembayaran Langganan dari bonus, penyelesaian piutang penarikan) diputuskan Coach kemudian pada hari yang sama dan dicantumkan di dokumen v1.4.</w:t>
       </w:r>
     </w:p>
     <w:tbl>
@@ -6781,6 +6781,104 @@
           </w:p>
         </w:tc>
       </w:tr>
+      <w:tr>
+        <w:trPr>
+          <w:cantSplit w:val="true"/>
+        </w:trPr>
+        <w:tc>
+          <w:tcPr>
+            <w:tcW w:w="558" w:type="dxa"/>
+            <w:tcBorders>
+              <w:top w:val="single" w:sz="4" w:space="0" w:color="B7C4C9"/>
+              <w:left w:val="single" w:sz="4" w:space="0" w:color="B7C4C9"/>
+              <w:bottom w:val="single" w:sz="4" w:space="0" w:color="B7C4C9"/>
+              <w:right w:val="single" w:sz="4" w:space="0" w:color="B7C4C9"/>
+            </w:tcBorders>
+          </w:tcPr>
+          <w:p>
+            <w:pPr>
+              <w:pStyle w:val="Normal"/>
+              <w:spacing w:before="0" w:after="0"/>
+              <w:jc w:val="left"/>
+              <w:rPr/>
+            </w:pPr>
+            <w:r>
+              <w:rPr>
+                <w:sz w:val="19"/>
+                <w:szCs w:val="19"/>
+              </w:rPr>
+              <w:t>A18</w:t>
+            </w:r>
+          </w:p>
+        </w:tc>
+        <w:tc>
+          <w:tcPr>
+            <w:tcW w:w="5583" w:type="dxa"/>
+            <w:tcBorders>
+              <w:top w:val="single" w:sz="4" w:space="0" w:color="B7C4C9"/>
+              <w:left w:val="single" w:sz="4" w:space="0" w:color="B7C4C9"/>
+              <w:bottom w:val="single" w:sz="4" w:space="0" w:color="B7C4C9"/>
+              <w:right w:val="single" w:sz="4" w:space="0" w:color="B7C4C9"/>
+            </w:tcBorders>
+          </w:tcPr>
+          <w:p>
+            <w:pPr>
+              <w:pStyle w:val="Normal"/>
+              <w:spacing w:before="0" w:after="0"/>
+              <w:jc w:val="left"/>
+              <w:rPr/>
+            </w:pPr>
+            <w:r>
+              <w:rPr>
+                <w:sz w:val="19"/>
+                <w:szCs w:val="19"/>
+              </w:rPr>
+              <w:t>Piutang penarikan bonus: dipotong dari transfer bonus berikutnya, lalu dari hak lain Mitra PLS (pembelian kembali Lisensi, pengembalian dana, atau pembayaran lain dari Perusahaan); sisa yang belum terpotong 12 bulan sejak penarikan dihapus dan tidak ditagih. Penghapusan tidak mengubah PPh yang sudah dipotong.</w:t>
+            </w:r>
+          </w:p>
+          <w:p>
+            <w:pPr>
+              <w:pStyle w:val="Normal"/>
+              <w:spacing w:before="0" w:after="0"/>
+              <w:jc w:val="left"/>
+              <w:rPr/>
+            </w:pPr>
+            <w:r>
+              <w:rPr>
+                <w:sz w:val="19"/>
+                <w:szCs w:val="19"/>
+              </w:rPr>
+              <w:t>Perlu dinilai: dasar memperhitungkan piutang dengan hak lain (perjumpaan utang, butir 19 Bagian 1), dan perlakuan pajak atas piutang yang dihapus</w:t>
+            </w:r>
+          </w:p>
+        </w:tc>
+        <w:tc>
+          <w:tcPr>
+            <w:tcW w:w="3165" w:type="dxa"/>
+            <w:tcBorders>
+              <w:top w:val="single" w:sz="4" w:space="0" w:color="B7C4C9"/>
+              <w:left w:val="single" w:sz="4" w:space="0" w:color="B7C4C9"/>
+              <w:bottom w:val="single" w:sz="4" w:space="0" w:color="B7C4C9"/>
+              <w:right w:val="single" w:sz="4" w:space="0" w:color="B7C4C9"/>
+            </w:tcBorders>
+          </w:tcPr>
+          <w:p>
+            <w:pPr>
+              <w:pStyle w:val="Normal"/>
+              <w:spacing w:before="0" w:after="0"/>
+              <w:jc w:val="left"/>
+              <w:rPr/>
+            </w:pPr>
+            <w:r>
+              <w:rPr>
+                <w:sz w:val="19"/>
+                <w:szCs w:val="19"/>
+              </w:rPr>
+              <w:t>Rencana Pemasaran Bab 13; Kode Etik Pasal 5; S&amp;K Pasal 7</w:t>
+            </w:r>
+          </w:p>
+        </w:tc>
+      </w:tr>
     </w:tbl>
     <w:p>
       <w:pPr>
@@ -7009,7 +7107,7 @@
       </w:pPr>
       <w:r>
         <w:rPr/>
-        <w:t>Coach mengonfirmasi Bagian 2. Keputusan A1–A17 sudah diambil dan dicantumkan di dokumen v1.3–v1.4 (Bagian 2B).</w:t>
+        <w:t>Coach mengonfirmasi Bagian 2. Keputusan A1–A18 sudah diambil dan dicantumkan di dokumen v1.3–v1.4 (Bagian 2B).</w:t>
       </w:r>
     </w:p>
     <w:p>

</xml_diff>

<commit_message>
Dokumen v1.4: atlastrade.io sebagai domain resmi pembayaran, pembatalan, dan pengembalian dana
- S&K Pasal 1, 2, 5, 7, 11; Kode Etik Pasal 1 (Halaman Pembayaran), 12, 15, 18 angka 15 (penomoran tetap); Rencana Pemasaran Bab 2 dan 6
- Nama PT diisi PT Mitra Transformasi Inteligensi, ditandai untuk dicocokkan dengan akta
- Catatan Konsultan Hukum: butir 20 Bagian 1 dan A20 Bagian 2B
- Kantor Maya: tombol bayar Langganan merujuk ke atlastrade.io
- Bab 14 arsitektur: tiga domain, satu instance Clerk

Co-Authored-By: Claude Opus 5.5 <noreply@anthropic.com>
Claude-Session: https://claude.ai/code/session_01C9951NUBJe5HCAhFhZ3PsQ
</commit_message>
<xml_diff>
--- a/docs/dokumen/Catatan_untuk_Konsultan_Hukum_Mitrans-Astra_v1.3.docx
+++ b/docs/dokumen/Catatan_untuk_Konsultan_Hukum_Mitrans-Astra_v1.3.docx
@@ -319,6 +319,24 @@
       <w:r>
         <w:rPr/>
         <w:t xml:space="preserve"> (27 Oktober 2026): menyertai dokumen v1.4 (Lisensi tanpa batas waktu, Langganan setiap 30 hari sejak aktivasi, rekening dana layanan dihapus, pembayaran Langganan dari bonus, penyelesaian piutang penarikan). Butir 17–19 Bagian 1 dan A14–A18 Bagian 2B baru; butir 4 dan 15 Bagian 1 diperbarui.</w:t>
+      </w:r>
+    </w:p>
+    <w:p>
+      <w:pPr>
+        <w:pStyle w:val="Normal"/>
+        <w:spacing w:before="0" w:after="120"/>
+        <w:rPr/>
+      </w:pPr>
+      <w:r>
+        <w:rPr>
+          <w:b/>
+          <w:bCs/>
+        </w:rPr>
+        <w:t>Tambahan 28 Oktober 2026</w:t>
+      </w:r>
+      <w:r>
+        <w:rPr/>
+        <w:t>: atlastrade.io menjadi domain resmi ketiga untuk pembelian, pembayaran, pembatalan, dan pengembalian dana, dikelola PT yang sama dan memakai satu akun. Butir 20 Bagian 1 dan A20 Bagian 2B baru.</w:t>
       </w:r>
     </w:p>
     <w:p>
@@ -3110,6 +3128,143 @@
           </w:p>
         </w:tc>
       </w:tr>
+      <w:tr>
+        <w:trPr>
+          <w:cantSplit w:val="true"/>
+        </w:trPr>
+        <w:tc>
+          <w:tcPr>
+            <w:tcW w:w="558" w:type="dxa"/>
+            <w:tcBorders>
+              <w:top w:val="single" w:sz="4" w:space="0" w:color="B7C4C9"/>
+              <w:left w:val="single" w:sz="4" w:space="0" w:color="B7C4C9"/>
+              <w:bottom w:val="single" w:sz="4" w:space="0" w:color="B7C4C9"/>
+              <w:right w:val="single" w:sz="4" w:space="0" w:color="B7C4C9"/>
+            </w:tcBorders>
+          </w:tcPr>
+          <w:p>
+            <w:pPr>
+              <w:pStyle w:val="Normal"/>
+              <w:spacing w:before="0" w:after="0"/>
+              <w:jc w:val="left"/>
+              <w:rPr/>
+            </w:pPr>
+            <w:r>
+              <w:rPr>
+                <w:sz w:val="19"/>
+                <w:szCs w:val="19"/>
+              </w:rPr>
+              <w:t>20</w:t>
+            </w:r>
+          </w:p>
+        </w:tc>
+        <w:tc>
+          <w:tcPr>
+            <w:tcW w:w="1395" w:type="dxa"/>
+            <w:tcBorders>
+              <w:top w:val="single" w:sz="4" w:space="0" w:color="B7C4C9"/>
+              <w:left w:val="single" w:sz="4" w:space="0" w:color="B7C4C9"/>
+              <w:bottom w:val="single" w:sz="4" w:space="0" w:color="B7C4C9"/>
+              <w:right w:val="single" w:sz="4" w:space="0" w:color="B7C4C9"/>
+            </w:tcBorders>
+          </w:tcPr>
+          <w:p>
+            <w:pPr>
+              <w:pStyle w:val="Normal"/>
+              <w:spacing w:before="0" w:after="0"/>
+              <w:jc w:val="left"/>
+              <w:rPr/>
+            </w:pPr>
+            <w:r>
+              <w:rPr>
+                <w:b/>
+                <w:bCs/>
+                <w:sz w:val="19"/>
+                <w:szCs w:val="19"/>
+              </w:rPr>
+              <w:t>Tiga domain dengan satu akun (mitrans.id, affiliatemarketing.network, atlastrade.io)</w:t>
+            </w:r>
+          </w:p>
+        </w:tc>
+        <w:tc>
+          <w:tcPr>
+            <w:tcW w:w="2045" w:type="dxa"/>
+            <w:tcBorders>
+              <w:top w:val="single" w:sz="4" w:space="0" w:color="B7C4C9"/>
+              <w:left w:val="single" w:sz="4" w:space="0" w:color="B7C4C9"/>
+              <w:bottom w:val="single" w:sz="4" w:space="0" w:color="B7C4C9"/>
+              <w:right w:val="single" w:sz="4" w:space="0" w:color="B7C4C9"/>
+            </w:tcBorders>
+          </w:tcPr>
+          <w:p>
+            <w:pPr>
+              <w:pStyle w:val="Normal"/>
+              <w:spacing w:before="0" w:after="0"/>
+              <w:jc w:val="left"/>
+              <w:rPr/>
+            </w:pPr>
+            <w:r>
+              <w:rPr>
+                <w:sz w:val="19"/>
+                <w:szCs w:val="19"/>
+              </w:rPr>
+              <w:t>Permendag 70/2019 Pasal 8 ayat (1) (identitas dan informasi Perusahaan); UU 27/2022 tentang Pelindungan Data Pribadi; PP 71/2019 (pendaftaran PSE)</w:t>
+            </w:r>
+          </w:p>
+        </w:tc>
+        <w:tc>
+          <w:tcPr>
+            <w:tcW w:w="2421" w:type="dxa"/>
+            <w:tcBorders>
+              <w:top w:val="single" w:sz="4" w:space="0" w:color="B7C4C9"/>
+              <w:left w:val="single" w:sz="4" w:space="0" w:color="B7C4C9"/>
+              <w:bottom w:val="single" w:sz="4" w:space="0" w:color="B7C4C9"/>
+              <w:right w:val="single" w:sz="4" w:space="0" w:color="B7C4C9"/>
+            </w:tcBorders>
+          </w:tcPr>
+          <w:p>
+            <w:pPr>
+              <w:pStyle w:val="Normal"/>
+              <w:spacing w:before="0" w:after="0"/>
+              <w:jc w:val="left"/>
+              <w:rPr/>
+            </w:pPr>
+            <w:r>
+              <w:rPr>
+                <w:sz w:val="19"/>
+                <w:szCs w:val="19"/>
+              </w:rPr>
+              <w:t>Pembelian, pembayaran, pembatalan, dan pengembalian dana dilakukan di atlastrade.io; tautan rujukan di affiliatemarketing.network; akun dan dokumen resmi di mitrans.id. Ketiganya dikelola PT Mitra Transformasi Inteligensi dan memakai satu akun (Clerk). Sponsor dibawa dari tautan rujukan ke checkout dengan tiket bertanda tangan tanpa data pribadi; pembayaran dan pengembalian dana dikirim ke sistem komisi secara otomatis. NIK diisi sekali di checkout</w:t>
+            </w:r>
+          </w:p>
+        </w:tc>
+        <w:tc>
+          <w:tcPr>
+            <w:tcW w:w="2887" w:type="dxa"/>
+            <w:tcBorders>
+              <w:top w:val="single" w:sz="4" w:space="0" w:color="B7C4C9"/>
+              <w:left w:val="single" w:sz="4" w:space="0" w:color="B7C4C9"/>
+              <w:bottom w:val="single" w:sz="4" w:space="0" w:color="B7C4C9"/>
+              <w:right w:val="single" w:sz="4" w:space="0" w:color="B7C4C9"/>
+            </w:tcBorders>
+          </w:tcPr>
+          <w:p>
+            <w:pPr>
+              <w:pStyle w:val="Normal"/>
+              <w:spacing w:before="0" w:after="0"/>
+              <w:jc w:val="left"/>
+              <w:rPr/>
+            </w:pPr>
+            <w:r>
+              <w:rPr>
+                <w:sz w:val="19"/>
+                <w:szCs w:val="19"/>
+              </w:rPr>
+              <w:t>Konfirmasi: (a) ketiga domain cukup dicantumkan di dokumen dan pengajuan izin sebagai situs resmi PT yang sama, dan apakah masing-masing perlu didaftarkan sebagai PSE; (b) satu Kebijakan Privasi untuk ketiga domain cukup sebagai dasar berbagi data di dalam PT yang sama; (c) halaman pembayaran atlastrade.io menampilkan identitas PT, harga, dan hak pembatalan sesuai UU Perlindungan Konsumen; (d) kepemilikan dan pengelolaan nama domain atas nama PT</w:t>
+            </w:r>
+          </w:p>
+        </w:tc>
+      </w:tr>
     </w:tbl>
     <w:p>
       <w:pPr>
@@ -6879,6 +7034,104 @@
           </w:p>
         </w:tc>
       </w:tr>
+      <w:tr>
+        <w:trPr>
+          <w:cantSplit w:val="true"/>
+        </w:trPr>
+        <w:tc>
+          <w:tcPr>
+            <w:tcW w:w="558" w:type="dxa"/>
+            <w:tcBorders>
+              <w:top w:val="single" w:sz="4" w:space="0" w:color="B7C4C9"/>
+              <w:left w:val="single" w:sz="4" w:space="0" w:color="B7C4C9"/>
+              <w:bottom w:val="single" w:sz="4" w:space="0" w:color="B7C4C9"/>
+              <w:right w:val="single" w:sz="4" w:space="0" w:color="B7C4C9"/>
+            </w:tcBorders>
+          </w:tcPr>
+          <w:p>
+            <w:pPr>
+              <w:pStyle w:val="Normal"/>
+              <w:spacing w:before="0" w:after="0"/>
+              <w:jc w:val="left"/>
+              <w:rPr/>
+            </w:pPr>
+            <w:r>
+              <w:rPr>
+                <w:sz w:val="19"/>
+                <w:szCs w:val="19"/>
+              </w:rPr>
+              <w:t>A20</w:t>
+            </w:r>
+          </w:p>
+        </w:tc>
+        <w:tc>
+          <w:tcPr>
+            <w:tcW w:w="5583" w:type="dxa"/>
+            <w:tcBorders>
+              <w:top w:val="single" w:sz="4" w:space="0" w:color="B7C4C9"/>
+              <w:left w:val="single" w:sz="4" w:space="0" w:color="B7C4C9"/>
+              <w:bottom w:val="single" w:sz="4" w:space="0" w:color="B7C4C9"/>
+              <w:right w:val="single" w:sz="4" w:space="0" w:color="B7C4C9"/>
+            </w:tcBorders>
+          </w:tcPr>
+          <w:p>
+            <w:pPr>
+              <w:pStyle w:val="Normal"/>
+              <w:spacing w:before="0" w:after="0"/>
+              <w:jc w:val="left"/>
+              <w:rPr/>
+            </w:pPr>
+            <w:r>
+              <w:rPr>
+                <w:sz w:val="19"/>
+                <w:szCs w:val="19"/>
+              </w:rPr>
+              <w:t>Tiga domain, satu akun: atlastrade.io untuk pembelian, pembayaran, pembatalan, dan pengembalian dana; affiliatemarketing.network untuk tautan rujukan; mitrans.id untuk akun dan dokumen resmi. Sponsor tercatat otomatis dari tautan rujukan dan dikunci saat akun pertama dibuat; pembelian tanpa tautan rujukan yang sah dicatat sebagai penjualan langsung Perusahaan.</w:t>
+            </w:r>
+          </w:p>
+          <w:p>
+            <w:pPr>
+              <w:pStyle w:val="Normal"/>
+              <w:spacing w:before="0" w:after="0"/>
+              <w:jc w:val="left"/>
+              <w:rPr/>
+            </w:pPr>
+            <w:r>
+              <w:rPr>
+                <w:sz w:val="19"/>
+                <w:szCs w:val="19"/>
+              </w:rPr>
+              <w:t>Perlu dinilai: butir 20 Bagian 1</w:t>
+            </w:r>
+          </w:p>
+        </w:tc>
+        <w:tc>
+          <w:tcPr>
+            <w:tcW w:w="3165" w:type="dxa"/>
+            <w:tcBorders>
+              <w:top w:val="single" w:sz="4" w:space="0" w:color="B7C4C9"/>
+              <w:left w:val="single" w:sz="4" w:space="0" w:color="B7C4C9"/>
+              <w:bottom w:val="single" w:sz="4" w:space="0" w:color="B7C4C9"/>
+              <w:right w:val="single" w:sz="4" w:space="0" w:color="B7C4C9"/>
+            </w:tcBorders>
+          </w:tcPr>
+          <w:p>
+            <w:pPr>
+              <w:pStyle w:val="Normal"/>
+              <w:spacing w:before="0" w:after="0"/>
+              <w:jc w:val="left"/>
+              <w:rPr/>
+            </w:pPr>
+            <w:r>
+              <w:rPr>
+                <w:sz w:val="19"/>
+                <w:szCs w:val="19"/>
+              </w:rPr>
+              <w:t>Rencana Pemasaran Bab 2 dan Bab 6; Kode Etik Pasal 1, 12, 15, dan 18; S&amp;K Pasal 1, 2, 5, 7, dan 11</w:t>
+            </w:r>
+          </w:p>
+        </w:tc>
+      </w:tr>
     </w:tbl>
     <w:p>
       <w:pPr>
@@ -6902,7 +7155,7 @@
       </w:pPr>
       <w:r>
         <w:rPr/>
-        <w:t>Nama lengkap PT sesuai akta, nomor akta, dan pengesahan Kementerian Hukum.</w:t>
+        <w:t>Nama lengkap PT sesuai akta, nomor akta, dan pengesahan Kementerian Hukum. Coach menyebut PT Mitra Transformasi Inteligensi (28 Oktober 2026); ejaan perlu dicocokkan dengan akta, lalu dipakai di ketiga dokumen.</w:t>
       </w:r>
     </w:p>
     <w:p>
@@ -7072,16 +7325,6 @@
     </w:p>
     <w:p>
       <w:pPr>
-        <w:pStyle w:val="Heading2"/>
-        <w:rPr/>
-      </w:pPr>
-      <w:r>
-        <w:rPr/>
-        <w:t>4. Langkah berikutnya</w:t>
-      </w:r>
-    </w:p>
-    <w:p>
-      <w:pPr>
         <w:pStyle w:val="ListParagraph"/>
         <w:numPr>
           <w:ilvl w:val="0"/>
@@ -7092,7 +7335,17 @@
       </w:pPr>
       <w:r>
         <w:rPr/>
-        <w:t>Konsultan hukum memutuskan butir 1–9 di Bagian 1.</w:t>
+        <w:t>Kebijakan Privasi bersama untuk mitrans.id, affiliatemarketing.network, dan atlastrade.io, termasuk pencatatan pengendali data dan penyimpanan data.</w:t>
+      </w:r>
+    </w:p>
+    <w:p>
+      <w:pPr>
+        <w:pStyle w:val="Heading2"/>
+        <w:rPr/>
+      </w:pPr>
+      <w:r>
+        <w:rPr/>
+        <w:t>4. Langkah berikutnya</w:t>
       </w:r>
     </w:p>
     <w:p>
@@ -7107,7 +7360,7 @@
       </w:pPr>
       <w:r>
         <w:rPr/>
-        <w:t>Coach mengonfirmasi Bagian 2. Keputusan A1–A18 sudah diambil dan dicantumkan di dokumen v1.3–v1.4 (Bagian 2B).</w:t>
+        <w:t>Konsultan hukum memutuskan butir 1–9 di Bagian 1.</w:t>
       </w:r>
     </w:p>
     <w:p>
@@ -7122,7 +7375,7 @@
       </w:pPr>
       <w:r>
         <w:rPr/>
-        <w:t>Tim melengkapi Bagian 3.</w:t>
+        <w:t>Coach mengonfirmasi Bagian 2. Keputusan A1–A18 sudah diambil dan dicantumkan di dokumen v1.3–v1.4 (Bagian 2B). Keputusan A20 (tiga domain, satu akun) ditambahkan 28 Oktober 2026.</w:t>
       </w:r>
     </w:p>
     <w:p>
@@ -7137,6 +7390,21 @@
       </w:pPr>
       <w:r>
         <w:rPr/>
+        <w:t>Tim melengkapi Bagian 3.</w:t>
+      </w:r>
+    </w:p>
+    <w:p>
+      <w:pPr>
+        <w:pStyle w:val="ListParagraph"/>
+        <w:numPr>
+          <w:ilvl w:val="0"/>
+          <w:numId w:val="35"/>
+        </w:numPr>
+        <w:spacing w:before="0" w:after="60"/>
+        <w:rPr/>
+      </w:pPr>
+      <w:r>
+        <w:rPr/>
         <w:t>Ketiga dokumen diperbarui, lalu diajukan ke asosiasi untuk verifikasi sebelum pengajuan izin melalui sistem OSS.</w:t>
       </w:r>
     </w:p>
@@ -7145,7 +7413,7 @@
         <w:pStyle w:val="ListParagraph"/>
         <w:numPr>
           <w:ilvl w:val="0"/>
-          <w:numId w:val="35"/>
+          <w:numId w:val="36"/>
         </w:numPr>
         <w:spacing w:before="0" w:after="60"/>
         <w:rPr/>
@@ -7232,7 +7500,7 @@
     </w:r>
     <w:r>
       <w:rPr/>
-      <w:t>9</w:t>
+      <w:t>10</w:t>
     </w:r>
     <w:r>
       <w:rPr/>
@@ -7260,7 +7528,7 @@
     </w:r>
     <w:r>
       <w:rPr/>
-      <w:t>9</w:t>
+      <w:t>10</w:t>
     </w:r>
     <w:r>
       <w:rPr/>
@@ -8631,12 +8899,12 @@
   </w:num>
   <w:num w:numId="31">
     <w:abstractNumId w:val="4"/>
+  </w:num>
+  <w:num w:numId="32">
+    <w:abstractNumId w:val="4"/>
     <w:lvlOverride w:ilvl="0">
       <w:startOverride w:val="1"/>
     </w:lvlOverride>
-  </w:num>
-  <w:num w:numId="32">
-    <w:abstractNumId w:val="4"/>
   </w:num>
   <w:num w:numId="33">
     <w:abstractNumId w:val="4"/>
@@ -8645,6 +8913,9 @@
     <w:abstractNumId w:val="4"/>
   </w:num>
   <w:num w:numId="35">
+    <w:abstractNumId w:val="4"/>
+  </w:num>
+  <w:num w:numId="36">
     <w:abstractNumId w:val="4"/>
   </w:num>
 </w:numbering>

</xml_diff>

<commit_message>
Dokumen v1.4 (tambahan kedua): Kantor Maya di affiliatemarketing.network, e-book Mitra PLS, Sponsor dari e-book
- S&K Pasal 1, 11, 22; Kode Etik Pasal 1, 4, 12; Rencana Pemasaran Bab 2, 3, 6, 7, 14 (perubahan terlacak, penomoran larangan tetap)
- Penawaran webinar RT3: Lisensi Rp7.500.000 termasuk akses 30 hari; Langganan mulai hari ke-30
- Catatan Konsultan Hukum: butir 21 dan A21-A23
- Arsitektur: keputusan A21-A23 dan Bab 15; spesifikasi atlastrade.io: nilai rujukan ebook

Co-Authored-By: Claude Opus 5.5 <noreply@anthropic.com>
Claude-Session: https://claude.ai/code/session_01C9951NUBJe5HCAhFhZ3PsQ
</commit_message>
<xml_diff>
--- a/docs/dokumen/Catatan_untuk_Konsultan_Hukum_Mitrans-Astra_v1.3.docx
+++ b/docs/dokumen/Catatan_untuk_Konsultan_Hukum_Mitrans-Astra_v1.3.docx
@@ -337,6 +337,24 @@
       <w:r>
         <w:rPr/>
         <w:t>: atlastrade.io menjadi domain resmi ketiga untuk pembelian, pembayaran, pembatalan, dan pengembalian dana, dikelola PT yang sama dan memakai satu akun. Butir 20 Bagian 1 dan A20 Bagian 2B baru.</w:t>
+      </w:r>
+    </w:p>
+    <w:p>
+      <w:pPr>
+        <w:pStyle w:val="Normal"/>
+        <w:spacing w:before="0" w:after="120"/>
+        <w:rPr/>
+      </w:pPr>
+      <w:r>
+        <w:rPr>
+          <w:b/>
+          <w:bCs/>
+        </w:rPr>
+        <w:t>Tambahan kedua 28 Oktober 2026</w:t>
+      </w:r>
+      <w:r>
+        <w:rPr/>
+        <w:t>: Kantor Maya pindah ke affiliatemarketing.network (mitrans.id untuk profil Perusahaan); e-book buatan Mitra PLS dijual melalui Agent Marketing dengan persetujuan Perusahaan, tanpa PV, komisi, atau bonus; Sponsor dikunci dari pembelian e-book. Butir 21 Bagian 1 dan A21–A23 Bagian 2B baru; butir 12 diperbarui.</w:t>
       </w:r>
     </w:p>
     <w:p>
@@ -2138,7 +2156,7 @@
                 <w:sz w:val="19"/>
                 <w:szCs w:val="19"/>
               </w:rPr>
-              <w:t>Mitra membagikan tautan e-book Ylive Academy tanpa komisi. Data pembeli e-book diteruskan ke PT MITRANS dengan izin</w:t>
+              <w:t>Mitra membagikan tautan e-book Ylive Academy tanpa komisi. Data pembeli e-book diteruskan ke PT MITRANS dengan izin Diperbarui 28 Oktober 2026: diganti e-book buatan Mitra PLS yang dijual melalui Agent Marketing (butir 21).</w:t>
             </w:r>
           </w:p>
         </w:tc>
@@ -3261,6 +3279,143 @@
                 <w:szCs w:val="19"/>
               </w:rPr>
               <w:t>Konfirmasi: (a) ketiga domain cukup dicantumkan di dokumen dan pengajuan izin sebagai situs resmi PT yang sama, dan apakah masing-masing perlu didaftarkan sebagai PSE; (b) satu Kebijakan Privasi untuk ketiga domain cukup sebagai dasar berbagi data di dalam PT yang sama; (c) halaman pembayaran atlastrade.io menampilkan identitas PT, harga, dan hak pembatalan sesuai UU Perlindungan Konsumen; (d) kepemilikan dan pengelolaan nama domain atas nama PT</w:t>
+            </w:r>
+          </w:p>
+        </w:tc>
+      </w:tr>
+      <w:tr>
+        <w:trPr>
+          <w:cantSplit w:val="true"/>
+        </w:trPr>
+        <w:tc>
+          <w:tcPr>
+            <w:tcW w:w="558" w:type="dxa"/>
+            <w:tcBorders>
+              <w:top w:val="single" w:sz="4" w:space="0" w:color="B7C4C9"/>
+              <w:left w:val="single" w:sz="4" w:space="0" w:color="B7C4C9"/>
+              <w:bottom w:val="single" w:sz="4" w:space="0" w:color="B7C4C9"/>
+              <w:right w:val="single" w:sz="4" w:space="0" w:color="B7C4C9"/>
+            </w:tcBorders>
+          </w:tcPr>
+          <w:p>
+            <w:pPr>
+              <w:pStyle w:val="Normal"/>
+              <w:spacing w:before="0" w:after="0"/>
+              <w:jc w:val="left"/>
+              <w:rPr/>
+            </w:pPr>
+            <w:r>
+              <w:rPr>
+                <w:sz w:val="19"/>
+                <w:szCs w:val="19"/>
+              </w:rPr>
+              <w:t>21</w:t>
+            </w:r>
+          </w:p>
+        </w:tc>
+        <w:tc>
+          <w:tcPr>
+            <w:tcW w:w="1395" w:type="dxa"/>
+            <w:tcBorders>
+              <w:top w:val="single" w:sz="4" w:space="0" w:color="B7C4C9"/>
+              <w:left w:val="single" w:sz="4" w:space="0" w:color="B7C4C9"/>
+              <w:bottom w:val="single" w:sz="4" w:space="0" w:color="B7C4C9"/>
+              <w:right w:val="single" w:sz="4" w:space="0" w:color="B7C4C9"/>
+            </w:tcBorders>
+          </w:tcPr>
+          <w:p>
+            <w:pPr>
+              <w:pStyle w:val="Normal"/>
+              <w:spacing w:before="0" w:after="0"/>
+              <w:jc w:val="left"/>
+              <w:rPr/>
+            </w:pPr>
+            <w:r>
+              <w:rPr>
+                <w:b/>
+                <w:bCs/>
+                <w:sz w:val="19"/>
+                <w:szCs w:val="19"/>
+              </w:rPr>
+              <w:t>E-book buatan Mitra PLS dijual melalui platform Perusahaan</w:t>
+            </w:r>
+          </w:p>
+        </w:tc>
+        <w:tc>
+          <w:tcPr>
+            <w:tcW w:w="2045" w:type="dxa"/>
+            <w:tcBorders>
+              <w:top w:val="single" w:sz="4" w:space="0" w:color="B7C4C9"/>
+              <w:left w:val="single" w:sz="4" w:space="0" w:color="B7C4C9"/>
+              <w:bottom w:val="single" w:sz="4" w:space="0" w:color="B7C4C9"/>
+              <w:right w:val="single" w:sz="4" w:space="0" w:color="B7C4C9"/>
+            </w:tcBorders>
+          </w:tcPr>
+          <w:p>
+            <w:pPr>
+              <w:pStyle w:val="Normal"/>
+              <w:spacing w:before="0" w:after="0"/>
+              <w:jc w:val="left"/>
+              <w:rPr/>
+            </w:pPr>
+            <w:r>
+              <w:rPr>
+                <w:sz w:val="19"/>
+                <w:szCs w:val="19"/>
+              </w:rPr>
+              <w:t>Permendag 70/2019 (barang yang dipasarkan dalam Program Pemasaran; Pasal 21); UU 8/1999 tentang Perlindungan Konsumen; PP 80/2019 tentang Perdagangan melalui Sistem Elektronik; UU 28/2014 tentang Hak Cipta; UU 4/2023 (P2SK) dan ketentuan OJK tentang penasihat investasi; UU 27/2022</w:t>
+            </w:r>
+          </w:p>
+        </w:tc>
+        <w:tc>
+          <w:tcPr>
+            <w:tcW w:w="2421" w:type="dxa"/>
+            <w:tcBorders>
+              <w:top w:val="single" w:sz="4" w:space="0" w:color="B7C4C9"/>
+              <w:left w:val="single" w:sz="4" w:space="0" w:color="B7C4C9"/>
+              <w:bottom w:val="single" w:sz="4" w:space="0" w:color="B7C4C9"/>
+              <w:right w:val="single" w:sz="4" w:space="0" w:color="B7C4C9"/>
+            </w:tcBorders>
+          </w:tcPr>
+          <w:p>
+            <w:pPr>
+              <w:pStyle w:val="Normal"/>
+              <w:spacing w:before="0" w:after="0"/>
+              <w:jc w:val="left"/>
+              <w:rPr/>
+            </w:pPr>
+            <w:r>
+              <w:rPr>
+                <w:sz w:val="19"/>
+                <w:szCs w:val="19"/>
+              </w:rPr>
+              <w:t>Mitra PLS membuat e-book dan halaman penawaran di Agent Marketing (gratis), diperiksa dan disetujui Kepatuhan sebelum tayang, harga Rp25.000–Rp150.000. Pembayaran lewat Xendit di platform, diteruskan ke rekening Mitra PLS; tanpa PV, komisi, atau bonus. Pembelian e-book mengunci Sponsor pembeli untuk pembelian Lisensi berikutnya. Mitra PLS memasang iklan dan posting media sosial sendiri</w:t>
+            </w:r>
+          </w:p>
+        </w:tc>
+        <w:tc>
+          <w:tcPr>
+            <w:tcW w:w="2887" w:type="dxa"/>
+            <w:tcBorders>
+              <w:top w:val="single" w:sz="4" w:space="0" w:color="B7C4C9"/>
+              <w:left w:val="single" w:sz="4" w:space="0" w:color="B7C4C9"/>
+              <w:bottom w:val="single" w:sz="4" w:space="0" w:color="B7C4C9"/>
+              <w:right w:val="single" w:sz="4" w:space="0" w:color="B7C4C9"/>
+            </w:tcBorders>
+          </w:tcPr>
+          <w:p>
+            <w:pPr>
+              <w:pStyle w:val="Normal"/>
+              <w:spacing w:before="0" w:after="0"/>
+              <w:jc w:val="left"/>
+              <w:rPr/>
+            </w:pPr>
+            <w:r>
+              <w:rPr>
+                <w:sz w:val="19"/>
+                <w:szCs w:val="19"/>
+              </w:rPr>
+              <w:t>Konfirmasi: (a) e-book milik Mitra PLS tidak dinilai sebagai barang lain yang dipasarkan melalui jaringan, dan pengikatan Sponsor dari e-book tidak menjadikannya bagian Program Pemasaran; (b) kedudukan Perusahaan sebagai penyelenggara sistem elektronik dan Mitra PLS sebagai penjual, termasuk kewajiban atas pengembalian dana dan bukti pembelian; (c) e-book edukasi tidak termasuk nasihat investasi yang memerlukan izin; (d) siapa pengendali data pembeli e-book; (e) pajak atas penjualan e-book oleh Mitra PLS dan atas penerusan dana; (f) kewajiban Perusahaan bila e-book melanggar hak cipta</w:t>
             </w:r>
           </w:p>
         </w:tc>
@@ -7132,6 +7287,285 @@
           </w:p>
         </w:tc>
       </w:tr>
+      <w:tr>
+        <w:trPr>
+          <w:cantSplit w:val="true"/>
+        </w:trPr>
+        <w:tc>
+          <w:tcPr>
+            <w:tcW w:w="558" w:type="dxa"/>
+            <w:tcBorders>
+              <w:top w:val="single" w:sz="4" w:space="0" w:color="B7C4C9"/>
+              <w:left w:val="single" w:sz="4" w:space="0" w:color="B7C4C9"/>
+              <w:bottom w:val="single" w:sz="4" w:space="0" w:color="B7C4C9"/>
+              <w:right w:val="single" w:sz="4" w:space="0" w:color="B7C4C9"/>
+            </w:tcBorders>
+          </w:tcPr>
+          <w:p>
+            <w:pPr>
+              <w:pStyle w:val="Normal"/>
+              <w:spacing w:before="0" w:after="0"/>
+              <w:jc w:val="left"/>
+              <w:rPr/>
+            </w:pPr>
+            <w:r>
+              <w:rPr>
+                <w:sz w:val="19"/>
+                <w:szCs w:val="19"/>
+              </w:rPr>
+              <w:t>A21</w:t>
+            </w:r>
+          </w:p>
+        </w:tc>
+        <w:tc>
+          <w:tcPr>
+            <w:tcW w:w="5583" w:type="dxa"/>
+            <w:tcBorders>
+              <w:top w:val="single" w:sz="4" w:space="0" w:color="B7C4C9"/>
+              <w:left w:val="single" w:sz="4" w:space="0" w:color="B7C4C9"/>
+              <w:bottom w:val="single" w:sz="4" w:space="0" w:color="B7C4C9"/>
+              <w:right w:val="single" w:sz="4" w:space="0" w:color="B7C4C9"/>
+            </w:tcBorders>
+          </w:tcPr>
+          <w:p>
+            <w:pPr>
+              <w:pStyle w:val="Normal"/>
+              <w:spacing w:before="0" w:after="0"/>
+              <w:jc w:val="left"/>
+              <w:rPr/>
+            </w:pPr>
+            <w:r>
+              <w:rPr>
+                <w:sz w:val="19"/>
+                <w:szCs w:val="19"/>
+              </w:rPr>
+              <w:t>Akun, pendaftaran Mitra PLS, Kantor Maya, dan Agent Marketing di affiliatemarketing.network; mitrans.id hanya untuk profil Perusahaan dan dokumen resmi. Pendaftaran Mitra PLS tetap gratis tanpa kewajiban membeli Lisensi.</w:t>
+            </w:r>
+          </w:p>
+        </w:tc>
+        <w:tc>
+          <w:tcPr>
+            <w:tcW w:w="3165" w:type="dxa"/>
+            <w:tcBorders>
+              <w:top w:val="single" w:sz="4" w:space="0" w:color="B7C4C9"/>
+              <w:left w:val="single" w:sz="4" w:space="0" w:color="B7C4C9"/>
+              <w:bottom w:val="single" w:sz="4" w:space="0" w:color="B7C4C9"/>
+              <w:right w:val="single" w:sz="4" w:space="0" w:color="B7C4C9"/>
+            </w:tcBorders>
+          </w:tcPr>
+          <w:p>
+            <w:pPr>
+              <w:pStyle w:val="Normal"/>
+              <w:spacing w:before="0" w:after="0"/>
+              <w:jc w:val="left"/>
+              <w:rPr/>
+            </w:pPr>
+            <w:r>
+              <w:rPr>
+                <w:sz w:val="19"/>
+                <w:szCs w:val="19"/>
+              </w:rPr>
+              <w:t>Rencana Pemasaran Bab 2, 6, 7; Kode Etik Pasal 1 dan 4; S&amp;K Pasal 1</w:t>
+            </w:r>
+          </w:p>
+        </w:tc>
+      </w:tr>
+      <w:tr>
+        <w:trPr>
+          <w:cantSplit w:val="true"/>
+        </w:trPr>
+        <w:tc>
+          <w:tcPr>
+            <w:tcW w:w="558" w:type="dxa"/>
+            <w:tcBorders>
+              <w:top w:val="single" w:sz="4" w:space="0" w:color="B7C4C9"/>
+              <w:left w:val="single" w:sz="4" w:space="0" w:color="B7C4C9"/>
+              <w:bottom w:val="single" w:sz="4" w:space="0" w:color="B7C4C9"/>
+              <w:right w:val="single" w:sz="4" w:space="0" w:color="B7C4C9"/>
+            </w:tcBorders>
+          </w:tcPr>
+          <w:p>
+            <w:pPr>
+              <w:pStyle w:val="Normal"/>
+              <w:spacing w:before="0" w:after="0"/>
+              <w:jc w:val="left"/>
+              <w:rPr/>
+            </w:pPr>
+            <w:r>
+              <w:rPr>
+                <w:sz w:val="19"/>
+                <w:szCs w:val="19"/>
+              </w:rPr>
+              <w:t>A22</w:t>
+            </w:r>
+          </w:p>
+        </w:tc>
+        <w:tc>
+          <w:tcPr>
+            <w:tcW w:w="5583" w:type="dxa"/>
+            <w:tcBorders>
+              <w:top w:val="single" w:sz="4" w:space="0" w:color="B7C4C9"/>
+              <w:left w:val="single" w:sz="4" w:space="0" w:color="B7C4C9"/>
+              <w:bottom w:val="single" w:sz="4" w:space="0" w:color="B7C4C9"/>
+              <w:right w:val="single" w:sz="4" w:space="0" w:color="B7C4C9"/>
+            </w:tcBorders>
+          </w:tcPr>
+          <w:p>
+            <w:pPr>
+              <w:pStyle w:val="Normal"/>
+              <w:spacing w:before="0" w:after="0"/>
+              <w:jc w:val="left"/>
+              <w:rPr/>
+            </w:pPr>
+            <w:r>
+              <w:rPr>
+                <w:sz w:val="19"/>
+                <w:szCs w:val="19"/>
+              </w:rPr>
+              <w:t>E-book Mitra PLS: harga Rp25.000–Rp150.000, persetujuan Perusahaan sebelum tayang, hasil penjualan ke rekening Mitra PLS, tanpa PV, komisi, atau bonus.</w:t>
+            </w:r>
+          </w:p>
+          <w:p>
+            <w:pPr>
+              <w:pStyle w:val="Normal"/>
+              <w:spacing w:before="0" w:after="0"/>
+              <w:jc w:val="left"/>
+              <w:rPr/>
+            </w:pPr>
+            <w:r>
+              <w:rPr>
+                <w:sz w:val="19"/>
+                <w:szCs w:val="19"/>
+              </w:rPr>
+              <w:t>Perlu dinilai: butir 21 Bagian 1</w:t>
+            </w:r>
+          </w:p>
+        </w:tc>
+        <w:tc>
+          <w:tcPr>
+            <w:tcW w:w="3165" w:type="dxa"/>
+            <w:tcBorders>
+              <w:top w:val="single" w:sz="4" w:space="0" w:color="B7C4C9"/>
+              <w:left w:val="single" w:sz="4" w:space="0" w:color="B7C4C9"/>
+              <w:bottom w:val="single" w:sz="4" w:space="0" w:color="B7C4C9"/>
+              <w:right w:val="single" w:sz="4" w:space="0" w:color="B7C4C9"/>
+            </w:tcBorders>
+          </w:tcPr>
+          <w:p>
+            <w:pPr>
+              <w:pStyle w:val="Normal"/>
+              <w:spacing w:before="0" w:after="0"/>
+              <w:jc w:val="left"/>
+              <w:rPr/>
+            </w:pPr>
+            <w:r>
+              <w:rPr>
+                <w:sz w:val="19"/>
+                <w:szCs w:val="19"/>
+              </w:rPr>
+              <w:t>Rencana Pemasaran 3.1 dan Bab 14; Kode Etik Pasal 12; S&amp;K Pasal 11 dan 22</w:t>
+            </w:r>
+          </w:p>
+        </w:tc>
+      </w:tr>
+      <w:tr>
+        <w:trPr>
+          <w:cantSplit w:val="true"/>
+        </w:trPr>
+        <w:tc>
+          <w:tcPr>
+            <w:tcW w:w="558" w:type="dxa"/>
+            <w:tcBorders>
+              <w:top w:val="single" w:sz="4" w:space="0" w:color="B7C4C9"/>
+              <w:left w:val="single" w:sz="4" w:space="0" w:color="B7C4C9"/>
+              <w:bottom w:val="single" w:sz="4" w:space="0" w:color="B7C4C9"/>
+              <w:right w:val="single" w:sz="4" w:space="0" w:color="B7C4C9"/>
+            </w:tcBorders>
+          </w:tcPr>
+          <w:p>
+            <w:pPr>
+              <w:pStyle w:val="Normal"/>
+              <w:spacing w:before="0" w:after="0"/>
+              <w:jc w:val="left"/>
+              <w:rPr/>
+            </w:pPr>
+            <w:r>
+              <w:rPr>
+                <w:sz w:val="19"/>
+                <w:szCs w:val="19"/>
+              </w:rPr>
+              <w:t>A23</w:t>
+            </w:r>
+          </w:p>
+        </w:tc>
+        <w:tc>
+          <w:tcPr>
+            <w:tcW w:w="5583" w:type="dxa"/>
+            <w:tcBorders>
+              <w:top w:val="single" w:sz="4" w:space="0" w:color="B7C4C9"/>
+              <w:left w:val="single" w:sz="4" w:space="0" w:color="B7C4C9"/>
+              <w:bottom w:val="single" w:sz="4" w:space="0" w:color="B7C4C9"/>
+              <w:right w:val="single" w:sz="4" w:space="0" w:color="B7C4C9"/>
+            </w:tcBorders>
+          </w:tcPr>
+          <w:p>
+            <w:pPr>
+              <w:pStyle w:val="Normal"/>
+              <w:spacing w:before="0" w:after="0"/>
+              <w:jc w:val="left"/>
+              <w:rPr/>
+            </w:pPr>
+            <w:r>
+              <w:rPr>
+                <w:sz w:val="19"/>
+                <w:szCs w:val="19"/>
+              </w:rPr>
+              <w:t>Sponsor dikunci saat pembelian e-book pertama dan tidak berubah oleh e-book atau tautan lain; dipakai saat pembeli membeli Lisensi di atlastrade.io. Kantor Maya membedakan bonus yang tercatat, ditetapkan, ditransfer, dan yang masih dapat ditarik.</w:t>
+            </w:r>
+          </w:p>
+          <w:p>
+            <w:pPr>
+              <w:pStyle w:val="Normal"/>
+              <w:spacing w:before="0" w:after="0"/>
+              <w:jc w:val="left"/>
+              <w:rPr/>
+            </w:pPr>
+            <w:r>
+              <w:rPr>
+                <w:sz w:val="19"/>
+                <w:szCs w:val="19"/>
+              </w:rPr>
+              <w:t>Perlu dinilai: butir 21 Bagian 1</w:t>
+            </w:r>
+          </w:p>
+        </w:tc>
+        <w:tc>
+          <w:tcPr>
+            <w:tcW w:w="3165" w:type="dxa"/>
+            <w:tcBorders>
+              <w:top w:val="single" w:sz="4" w:space="0" w:color="B7C4C9"/>
+              <w:left w:val="single" w:sz="4" w:space="0" w:color="B7C4C9"/>
+              <w:bottom w:val="single" w:sz="4" w:space="0" w:color="B7C4C9"/>
+              <w:right w:val="single" w:sz="4" w:space="0" w:color="B7C4C9"/>
+            </w:tcBorders>
+          </w:tcPr>
+          <w:p>
+            <w:pPr>
+              <w:pStyle w:val="Normal"/>
+              <w:spacing w:before="0" w:after="0"/>
+              <w:jc w:val="left"/>
+              <w:rPr/>
+            </w:pPr>
+            <w:r>
+              <w:rPr>
+                <w:sz w:val="19"/>
+                <w:szCs w:val="19"/>
+              </w:rPr>
+              <w:t>Rencana Pemasaran Bab 7; Kode Etik Pasal 1; S&amp;K Pasal 22</w:t>
+            </w:r>
+          </w:p>
+        </w:tc>
+      </w:tr>
     </w:tbl>
     <w:p>
       <w:pPr>
@@ -7340,16 +7774,6 @@
     </w:p>
     <w:p>
       <w:pPr>
-        <w:pStyle w:val="Heading2"/>
-        <w:rPr/>
-      </w:pPr>
-      <w:r>
-        <w:rPr/>
-        <w:t>4. Langkah berikutnya</w:t>
-      </w:r>
-    </w:p>
-    <w:p>
-      <w:pPr>
         <w:pStyle w:val="ListParagraph"/>
         <w:numPr>
           <w:ilvl w:val="0"/>
@@ -7360,7 +7784,17 @@
       </w:pPr>
       <w:r>
         <w:rPr/>
-        <w:t>Konsultan hukum memutuskan butir 1–9 di Bagian 1.</w:t>
+        <w:t>Skema penerusan dana penjualan e-book ke rekening Mitra PLS (mis. sub-akun penyedia pembayaran), termasuk siapa yang menerbitkan bukti pembelian kepada pembeli e-book.</w:t>
+      </w:r>
+    </w:p>
+    <w:p>
+      <w:pPr>
+        <w:pStyle w:val="Heading2"/>
+        <w:rPr/>
+      </w:pPr>
+      <w:r>
+        <w:rPr/>
+        <w:t>4. Langkah berikutnya</w:t>
       </w:r>
     </w:p>
     <w:p>
@@ -7375,7 +7809,7 @@
       </w:pPr>
       <w:r>
         <w:rPr/>
-        <w:t>Coach mengonfirmasi Bagian 2. Keputusan A1–A18 sudah diambil dan dicantumkan di dokumen v1.3–v1.4 (Bagian 2B). Keputusan A20 (tiga domain, satu akun) ditambahkan 28 Oktober 2026.</w:t>
+        <w:t>Konsultan hukum memutuskan butir 1–9 di Bagian 1.</w:t>
       </w:r>
     </w:p>
     <w:p>
@@ -7390,7 +7824,7 @@
       </w:pPr>
       <w:r>
         <w:rPr/>
-        <w:t>Tim melengkapi Bagian 3.</w:t>
+        <w:t>Coach mengonfirmasi Bagian 2. Keputusan A1–A18 sudah diambil dan dicantumkan di dokumen v1.3–v1.4 (Bagian 2B). Keputusan A20 (tiga domain, satu akun) ditambahkan 28 Oktober 2026.</w:t>
       </w:r>
     </w:p>
     <w:p>
@@ -7405,6 +7839,21 @@
       </w:pPr>
       <w:r>
         <w:rPr/>
+        <w:t>Tim melengkapi Bagian 3.</w:t>
+      </w:r>
+    </w:p>
+    <w:p>
+      <w:pPr>
+        <w:pStyle w:val="ListParagraph"/>
+        <w:numPr>
+          <w:ilvl w:val="0"/>
+          <w:numId w:val="36"/>
+        </w:numPr>
+        <w:spacing w:before="0" w:after="60"/>
+        <w:rPr/>
+      </w:pPr>
+      <w:r>
+        <w:rPr/>
         <w:t>Ketiga dokumen diperbarui, lalu diajukan ke asosiasi untuk verifikasi sebelum pengajuan izin melalui sistem OSS.</w:t>
       </w:r>
     </w:p>
@@ -7413,7 +7862,7 @@
         <w:pStyle w:val="ListParagraph"/>
         <w:numPr>
           <w:ilvl w:val="0"/>
-          <w:numId w:val="36"/>
+          <w:numId w:val="37"/>
         </w:numPr>
         <w:spacing w:before="0" w:after="60"/>
         <w:rPr/>
@@ -7500,7 +7949,7 @@
     </w:r>
     <w:r>
       <w:rPr/>
-      <w:t>10</w:t>
+      <w:t>11</w:t>
     </w:r>
     <w:r>
       <w:rPr/>
@@ -7528,7 +7977,7 @@
     </w:r>
     <w:r>
       <w:rPr/>
-      <w:t>10</w:t>
+      <w:t>11</w:t>
     </w:r>
     <w:r>
       <w:rPr/>
@@ -8902,12 +9351,12 @@
   </w:num>
   <w:num w:numId="32">
     <w:abstractNumId w:val="4"/>
+  </w:num>
+  <w:num w:numId="33">
+    <w:abstractNumId w:val="4"/>
     <w:lvlOverride w:ilvl="0">
       <w:startOverride w:val="1"/>
     </w:lvlOverride>
-  </w:num>
-  <w:num w:numId="33">
-    <w:abstractNumId w:val="4"/>
   </w:num>
   <w:num w:numId="34">
     <w:abstractNumId w:val="4"/>
@@ -8916,6 +9365,9 @@
     <w:abstractNumId w:val="4"/>
   </w:num>
   <w:num w:numId="36">
+    <w:abstractNumId w:val="4"/>
+  </w:num>
+  <w:num w:numId="37">
     <w:abstractNumId w:val="4"/>
   </w:num>
 </w:numbering>

</xml_diff>

<commit_message>
Catat keputusan A24: refund e-book ditanggung Mitra PLS, penerusan dana ditunda, kunci Sponsor permanen
- S&K Pasal 11 (WhatsApp: BERHENTI, jam tenang) dan Pasal 22 angka 8 (refund e-book)
- Catatan Konsultan Hukum: tambahan ketiga, A24, catatan penundaan skema dana
- Arsitektur: A24 dan rincian Bab 15

Co-Authored-By: Claude Opus 5.5 <noreply@anthropic.com>
Claude-Session: https://claude.ai/code/session_01C9951NUBJe5HCAhFhZ3PsQ
</commit_message>
<xml_diff>
--- a/docs/dokumen/Catatan_untuk_Konsultan_Hukum_Mitrans-Astra_v1.3.docx
+++ b/docs/dokumen/Catatan_untuk_Konsultan_Hukum_Mitrans-Astra_v1.3.docx
@@ -355,6 +355,24 @@
       <w:r>
         <w:rPr/>
         <w:t>: Kantor Maya pindah ke affiliatemarketing.network (mitrans.id untuk profil Perusahaan); e-book buatan Mitra PLS dijual melalui Agent Marketing dengan persetujuan Perusahaan, tanpa PV, komisi, atau bonus; Sponsor dikunci dari pembelian e-book. Butir 21 Bagian 1 dan A21–A23 Bagian 2B baru; butir 12 diperbarui.</w:t>
+      </w:r>
+    </w:p>
+    <w:p>
+      <w:pPr>
+        <w:pStyle w:val="Normal"/>
+        <w:spacing w:before="0" w:after="120"/>
+        <w:rPr/>
+      </w:pPr>
+      <w:r>
+        <w:rPr>
+          <w:b/>
+          <w:bCs/>
+        </w:rPr>
+        <w:t>Tambahan ketiga 28 Oktober 2026</w:t>
+      </w:r>
+      <w:r>
+        <w:rPr/>
+        <w:t>: Sponsor dari e-book berlaku permanen; pengembalian dana e-book ditanggung Mitra PLS dan diproses Perusahaan; skema penerusan dana e-book ditunda; pengingat WhatsApp hanya dengan persetujuan dan berhenti dengan balasan BERHENTI. A24 Bagian 2B baru.</w:t>
       </w:r>
     </w:p>
     <w:p>
@@ -7566,6 +7584,104 @@
           </w:p>
         </w:tc>
       </w:tr>
+      <w:tr>
+        <w:trPr>
+          <w:cantSplit w:val="true"/>
+        </w:trPr>
+        <w:tc>
+          <w:tcPr>
+            <w:tcW w:w="558" w:type="dxa"/>
+            <w:tcBorders>
+              <w:top w:val="single" w:sz="4" w:space="0" w:color="B7C4C9"/>
+              <w:left w:val="single" w:sz="4" w:space="0" w:color="B7C4C9"/>
+              <w:bottom w:val="single" w:sz="4" w:space="0" w:color="B7C4C9"/>
+              <w:right w:val="single" w:sz="4" w:space="0" w:color="B7C4C9"/>
+            </w:tcBorders>
+          </w:tcPr>
+          <w:p>
+            <w:pPr>
+              <w:pStyle w:val="Normal"/>
+              <w:spacing w:before="0" w:after="0"/>
+              <w:jc w:val="left"/>
+              <w:rPr/>
+            </w:pPr>
+            <w:r>
+              <w:rPr>
+                <w:sz w:val="19"/>
+                <w:szCs w:val="19"/>
+              </w:rPr>
+              <w:t>A24</w:t>
+            </w:r>
+          </w:p>
+        </w:tc>
+        <w:tc>
+          <w:tcPr>
+            <w:tcW w:w="5583" w:type="dxa"/>
+            <w:tcBorders>
+              <w:top w:val="single" w:sz="4" w:space="0" w:color="B7C4C9"/>
+              <w:left w:val="single" w:sz="4" w:space="0" w:color="B7C4C9"/>
+              <w:bottom w:val="single" w:sz="4" w:space="0" w:color="B7C4C9"/>
+              <w:right w:val="single" w:sz="4" w:space="0" w:color="B7C4C9"/>
+            </w:tcBorders>
+          </w:tcPr>
+          <w:p>
+            <w:pPr>
+              <w:pStyle w:val="Normal"/>
+              <w:spacing w:before="0" w:after="0"/>
+              <w:jc w:val="left"/>
+              <w:rPr/>
+            </w:pPr>
+            <w:r>
+              <w:rPr>
+                <w:sz w:val="19"/>
+                <w:szCs w:val="19"/>
+              </w:rPr>
+              <w:t>Pengembalian dana e-book: diproses Perusahaan lewat kanal pembayaran paling lambat 7 hari kerja, ditanggung Mitra PLS pemilik e-book. Penerusan dana e-book ditunda. Kunci Sponsor dari e-book permanen. E-book wajib berkas PDF; diunduh setelah asesmen. Kelas RT3 Selasa/Rabu/Kamis 19.00 WIB. Pengingat WhatsApp hanya dengan persetujuan, jam tenang 21.00–07.00 WIB, berhenti dengan BERHENTI.</w:t>
+            </w:r>
+          </w:p>
+          <w:p>
+            <w:pPr>
+              <w:pStyle w:val="Normal"/>
+              <w:spacing w:before="0" w:after="0"/>
+              <w:jc w:val="left"/>
+              <w:rPr/>
+            </w:pPr>
+            <w:r>
+              <w:rPr>
+                <w:sz w:val="19"/>
+                <w:szCs w:val="19"/>
+              </w:rPr>
+              <w:t>Perlu dinilai: butir 21 Bagian 1, khususnya siapa penjual yang bertanggung jawab kepada konsumen dan dasar memperhitungkan pengembalian dana dengan hasil penjualan Mitra PLS</w:t>
+            </w:r>
+          </w:p>
+        </w:tc>
+        <w:tc>
+          <w:tcPr>
+            <w:tcW w:w="3165" w:type="dxa"/>
+            <w:tcBorders>
+              <w:top w:val="single" w:sz="4" w:space="0" w:color="B7C4C9"/>
+              <w:left w:val="single" w:sz="4" w:space="0" w:color="B7C4C9"/>
+              <w:bottom w:val="single" w:sz="4" w:space="0" w:color="B7C4C9"/>
+              <w:right w:val="single" w:sz="4" w:space="0" w:color="B7C4C9"/>
+            </w:tcBorders>
+          </w:tcPr>
+          <w:p>
+            <w:pPr>
+              <w:pStyle w:val="Normal"/>
+              <w:spacing w:before="0" w:after="0"/>
+              <w:jc w:val="left"/>
+              <w:rPr/>
+            </w:pPr>
+            <w:r>
+              <w:rPr>
+                <w:sz w:val="19"/>
+                <w:szCs w:val="19"/>
+              </w:rPr>
+              <w:t>S&amp;K Pasal 11 dan 22</w:t>
+            </w:r>
+          </w:p>
+        </w:tc>
+      </w:tr>
     </w:tbl>
     <w:p>
       <w:pPr>
@@ -7789,16 +7905,6 @@
     </w:p>
     <w:p>
       <w:pPr>
-        <w:pStyle w:val="Heading2"/>
-        <w:rPr/>
-      </w:pPr>
-      <w:r>
-        <w:rPr/>
-        <w:t>4. Langkah berikutnya</w:t>
-      </w:r>
-    </w:p>
-    <w:p>
-      <w:pPr>
         <w:pStyle w:val="ListParagraph"/>
         <w:numPr>
           <w:ilvl w:val="0"/>
@@ -7809,7 +7915,17 @@
       </w:pPr>
       <w:r>
         <w:rPr/>
-        <w:t>Konsultan hukum memutuskan butir 1–9 di Bagian 1.</w:t>
+        <w:t>Keputusan Coach 28 Oktober 2026: skema penerusan dana e-book ditunda sampai ada jawaban penyedia pembayaran dan konsultan pajak; fitur pembayaran e-book belum dijalankan dengan uang sungguhan.</w:t>
+      </w:r>
+    </w:p>
+    <w:p>
+      <w:pPr>
+        <w:pStyle w:val="Heading2"/>
+        <w:rPr/>
+      </w:pPr>
+      <w:r>
+        <w:rPr/>
+        <w:t>4. Langkah berikutnya</w:t>
       </w:r>
     </w:p>
     <w:p>
@@ -7824,7 +7940,7 @@
       </w:pPr>
       <w:r>
         <w:rPr/>
-        <w:t>Coach mengonfirmasi Bagian 2. Keputusan A1–A18 sudah diambil dan dicantumkan di dokumen v1.3–v1.4 (Bagian 2B). Keputusan A20 (tiga domain, satu akun) ditambahkan 28 Oktober 2026.</w:t>
+        <w:t>Konsultan hukum memutuskan butir 1–9 di Bagian 1.</w:t>
       </w:r>
     </w:p>
     <w:p>
@@ -7839,7 +7955,7 @@
       </w:pPr>
       <w:r>
         <w:rPr/>
-        <w:t>Tim melengkapi Bagian 3.</w:t>
+        <w:t>Coach mengonfirmasi Bagian 2. Keputusan A1–A18 sudah diambil dan dicantumkan di dokumen v1.3–v1.4 (Bagian 2B). Keputusan A20 (tiga domain, satu akun) ditambahkan 28 Oktober 2026.</w:t>
       </w:r>
     </w:p>
     <w:p>
@@ -7854,6 +7970,21 @@
       </w:pPr>
       <w:r>
         <w:rPr/>
+        <w:t>Tim melengkapi Bagian 3.</w:t>
+      </w:r>
+    </w:p>
+    <w:p>
+      <w:pPr>
+        <w:pStyle w:val="ListParagraph"/>
+        <w:numPr>
+          <w:ilvl w:val="0"/>
+          <w:numId w:val="37"/>
+        </w:numPr>
+        <w:spacing w:before="0" w:after="60"/>
+        <w:rPr/>
+      </w:pPr>
+      <w:r>
+        <w:rPr/>
         <w:t>Ketiga dokumen diperbarui, lalu diajukan ke asosiasi untuk verifikasi sebelum pengajuan izin melalui sistem OSS.</w:t>
       </w:r>
     </w:p>
@@ -7862,7 +7993,7 @@
         <w:pStyle w:val="ListParagraph"/>
         <w:numPr>
           <w:ilvl w:val="0"/>
-          <w:numId w:val="37"/>
+          <w:numId w:val="38"/>
         </w:numPr>
         <w:spacing w:before="0" w:after="60"/>
         <w:rPr/>
@@ -7949,7 +8080,7 @@
     </w:r>
     <w:r>
       <w:rPr/>
-      <w:t>11</w:t>
+      <w:t>12</w:t>
     </w:r>
     <w:r>
       <w:rPr/>
@@ -7977,7 +8108,7 @@
     </w:r>
     <w:r>
       <w:rPr/>
-      <w:t>11</w:t>
+      <w:t>12</w:t>
     </w:r>
     <w:r>
       <w:rPr/>
@@ -9354,12 +9485,12 @@
   </w:num>
   <w:num w:numId="33">
     <w:abstractNumId w:val="4"/>
+  </w:num>
+  <w:num w:numId="34">
+    <w:abstractNumId w:val="4"/>
     <w:lvlOverride w:ilvl="0">
       <w:startOverride w:val="1"/>
     </w:lvlOverride>
-  </w:num>
-  <w:num w:numId="34">
-    <w:abstractNumId w:val="4"/>
   </w:num>
   <w:num w:numId="35">
     <w:abstractNumId w:val="4"/>
@@ -9368,6 +9499,9 @@
     <w:abstractNumId w:val="4"/>
   </w:num>
   <w:num w:numId="37">
+    <w:abstractNumId w:val="4"/>
+  </w:num>
+  <w:num w:numId="38">
     <w:abstractNumId w:val="4"/>
   </w:num>
 </w:numbering>

</xml_diff>